<commit_message>
Informe formativa U2: capturas con datos quedan para la sumativa
</commit_message>
<xml_diff>
--- a/docs/informes/Informe_Formativa_U2.docx
+++ b/docs/informes/Informe_Formativa_U2.docx
@@ -3400,22 +3400,7 @@
         <w:spacing w:after="140" w:line="300"/>
       </w:pPr>
       <w:r>
-        <w:t xml:space="preserve">Con la app funcionando, en la consola de Firebase (Realtime Database → Datos) se ven aparecer las tres estructuras y cómo crece el historial cada 3 segundos.</w:t>
-      </w:r>
-    </w:p>
-    <w:p>
-      <w:pPr>
-        <w:spacing w:after="200" w:before="120"/>
-        <w:jc w:val="center"/>
-      </w:pPr>
-      <w:r>
-        <w:rPr>
-          <w:b/>
-          <w:bCs/>
-          <w:highlight w:val="yellow"/>
-          <w:highlightCs w:val="yellow"/>
-        </w:rPr>
-        <w:t xml:space="preserve">[Pegar aquí la captura de la consola con estructuras e historial después de ejecutar la app]</w:t>
+        <w:t xml:space="preserve">Con la app funcionando, en la consola de Firebase (Realtime Database → Datos) se ven aparecer las tres estructuras y cómo crece el historial cada 3 segundos. Las capturas de la consola con los datos que envía la app las presentamos en la evaluación sumativa, junto con la app funcionando.</w:t>
       </w:r>
     </w:p>
     <w:p>
@@ -5773,7 +5758,7 @@
         </w:rPr>
         <w:t xml:space="preserve">Repositorio: </w:t>
       </w:r>
-      <w:hyperlink w:history="1" r:id="rId4ucpsmb4ekqdohec5n7e2">
+      <w:hyperlink w:history="1" r:id="rIdorvbuyx1dgf5kbacxwey5">
         <w:r>
           <w:rPr>
             <w:rStyle w:val="Hyperlink"/>

</xml_diff>